<commit_message>
Refine TiKV version map cache handling
</commit_message>
<xml_diff>
--- a/docs/TiKVDistributedVersionMapDesign.docx
+++ b/docs/TiKVDistributedVersionMapDesign.docx
@@ -132,297 +132,6 @@
           <w:p>
             <w:r>
               <w:rPr>
-                <w:b/>
-              </w:rPr>
-              <w:t>Option</w:t>
-            </w:r>
-          </w:p>
-        </w:tc>
-        <w:tc>
-          <w:tcPr>
-            <w:tcW w:w="2400" w:type="dxa"/>
-          </w:tcPr>
-          <w:p>
-            <w:r>
-              <w:rPr>
-                <w:b/>
-              </w:rPr>
-              <w:t>Default</w:t>
-            </w:r>
-          </w:p>
-        </w:tc>
-        <w:tc>
-          <w:tcPr>
-            <w:tcW w:w="2400" w:type="dxa"/>
-          </w:tcPr>
-          <w:p>
-            <w:r>
-              <w:rPr>
-                <w:b/>
-              </w:rPr>
-              <w:t>Meaning</w:t>
-            </w:r>
-          </w:p>
-        </w:tc>
-      </w:tr>
-      <w:tr>
-        <w:tc>
-          <w:tcPr>
-            <w:tcW w:w="2400" w:type="dxa"/>
-          </w:tcPr>
-          <w:p>
-            <w:r>
-              <w:rPr>
-                <w:rFonts w:ascii="Courier New" w:hAnsi="Courier New"/>
-                <w:color w:val="333333"/>
-              </w:rPr>
-              <w:t>DistributedVersionMap</w:t>
-            </w:r>
-          </w:p>
-        </w:tc>
-        <w:tc>
-          <w:tcPr>
-            <w:tcW w:w="2400" w:type="dxa"/>
-          </w:tcPr>
-          <w:p>
-            <w:r>
-              <w:rPr>
-                <w:rFonts w:ascii="Courier New" w:hAnsi="Courier New"/>
-                <w:color w:val="333333"/>
-              </w:rPr>
-              <w:t>true</w:t>
-            </w:r>
-          </w:p>
-        </w:tc>
-        <w:tc>
-          <w:tcPr>
-            <w:tcW w:w="2400" w:type="dxa"/>
-          </w:tcPr>
-          <w:p>
-            <w:r>
-              <w:t xml:space="preserve">Use </w:t>
-            </w:r>
-            <w:r>
-              <w:rPr>
-                <w:rFonts w:ascii="Courier New" w:hAnsi="Courier New"/>
-                <w:color w:val="333333"/>
-              </w:rPr>
-              <w:t>TiKVVersionMap</w:t>
-            </w:r>
-            <w:r>
-              <w:t xml:space="preserve"> when </w:t>
-            </w:r>
-            <w:r>
-              <w:rPr>
-                <w:rFonts w:ascii="Courier New" w:hAnsi="Courier New"/>
-                <w:color w:val="333333"/>
-              </w:rPr>
-              <w:t>Storage=TIKVIO</w:t>
-            </w:r>
-            <w:r>
-              <w:t xml:space="preserve">; otherwise use local in-memory </w:t>
-            </w:r>
-            <w:r>
-              <w:rPr>
-                <w:rFonts w:ascii="Courier New" w:hAnsi="Courier New"/>
-                <w:color w:val="333333"/>
-              </w:rPr>
-              <w:t>LocalVersionMap</w:t>
-            </w:r>
-            <w:r>
-              <w:t>.</w:t>
-            </w:r>
-          </w:p>
-        </w:tc>
-      </w:tr>
-      <w:tr>
-        <w:tc>
-          <w:tcPr>
-            <w:tcW w:w="2400" w:type="dxa"/>
-          </w:tcPr>
-          <w:p>
-            <w:r>
-              <w:rPr>
-                <w:rFonts w:ascii="Courier New" w:hAnsi="Courier New"/>
-                <w:color w:val="333333"/>
-              </w:rPr>
-              <w:t>SearchCheckVersionMapOnlyLayer0</w:t>
-            </w:r>
-          </w:p>
-        </w:tc>
-        <w:tc>
-          <w:tcPr>
-            <w:tcW w:w="2400" w:type="dxa"/>
-          </w:tcPr>
-          <w:p>
-            <w:r>
-              <w:rPr>
-                <w:rFonts w:ascii="Courier New" w:hAnsi="Courier New"/>
-                <w:color w:val="333333"/>
-              </w:rPr>
-              <w:t>false</w:t>
-            </w:r>
-          </w:p>
-        </w:tc>
-        <w:tc>
-          <w:tcPr>
-            <w:tcW w:w="2400" w:type="dxa"/>
-          </w:tcPr>
-          <w:p>
-            <w:r>
-              <w:t>When enabled with TiKV distributed VM, search checks the version map only on the current search target layer. For normal user search (</w:t>
-            </w:r>
-            <w:r>
-              <w:rPr>
-                <w:rFonts w:ascii="Courier New" w:hAnsi="Courier New"/>
-                <w:color w:val="333333"/>
-              </w:rPr>
-              <w:t>p_tolayer=0</w:t>
-            </w:r>
-            <w:r>
-              <w:t>), this means layer 0 only.</w:t>
-            </w:r>
-          </w:p>
-        </w:tc>
-      </w:tr>
-      <w:tr>
-        <w:tc>
-          <w:tcPr>
-            <w:tcW w:w="2400" w:type="dxa"/>
-          </w:tcPr>
-          <w:p>
-            <w:r>
-              <w:rPr>
-                <w:rFonts w:ascii="Courier New" w:hAnsi="Courier New"/>
-                <w:color w:val="333333"/>
-              </w:rPr>
-              <w:t>VersionChunkSize</w:t>
-            </w:r>
-          </w:p>
-        </w:tc>
-        <w:tc>
-          <w:tcPr>
-            <w:tcW w:w="2400" w:type="dxa"/>
-          </w:tcPr>
-          <w:p>
-            <w:r>
-              <w:rPr>
-                <w:rFonts w:ascii="Courier New" w:hAnsi="Courier New"/>
-                <w:color w:val="333333"/>
-              </w:rPr>
-              <w:t>4096</w:t>
-            </w:r>
-          </w:p>
-        </w:tc>
-        <w:tc>
-          <w:tcPr>
-            <w:tcW w:w="2400" w:type="dxa"/>
-          </w:tcPr>
-          <w:p>
-            <w:r>
-              <w:t>Number of VIDs stored in one TiKV version chunk.</w:t>
-            </w:r>
-          </w:p>
-        </w:tc>
-      </w:tr>
-      <w:tr>
-        <w:tc>
-          <w:tcPr>
-            <w:tcW w:w="2400" w:type="dxa"/>
-          </w:tcPr>
-          <w:p>
-            <w:r>
-              <w:rPr>
-                <w:rFonts w:ascii="Courier New" w:hAnsi="Courier New"/>
-                <w:color w:val="333333"/>
-              </w:rPr>
-              <w:t>VersionCacheMaxChunks</w:t>
-            </w:r>
-          </w:p>
-        </w:tc>
-        <w:tc>
-          <w:tcPr>
-            <w:tcW w:w="2400" w:type="dxa"/>
-          </w:tcPr>
-          <w:p>
-            <w:r>
-              <w:rPr>
-                <w:rFonts w:ascii="Courier New" w:hAnsi="Courier New"/>
-                <w:color w:val="333333"/>
-              </w:rPr>
-              <w:t>10000</w:t>
-            </w:r>
-          </w:p>
-        </w:tc>
-        <w:tc>
-          <w:tcPr>
-            <w:tcW w:w="2400" w:type="dxa"/>
-          </w:tcPr>
-          <w:p>
-            <w:r>
-              <w:t xml:space="preserve">Max chunks in the local LRU cache. </w:t>
-            </w:r>
-            <w:r>
-              <w:rPr>
-                <w:rFonts w:ascii="Courier New" w:hAnsi="Courier New"/>
-                <w:color w:val="333333"/>
-              </w:rPr>
-              <w:t>&lt;= 0</w:t>
-            </w:r>
-            <w:r>
-              <w:t xml:space="preserve"> disables cache.</w:t>
-            </w:r>
-          </w:p>
-        </w:tc>
-      </w:tr>
-      <w:tr>
-        <w:tc>
-          <w:tcPr>
-            <w:tcW w:w="2400" w:type="dxa"/>
-          </w:tcPr>
-          <w:p>
-            <w:r>
-              <w:rPr>
-                <w:rFonts w:ascii="Courier New" w:hAnsi="Courier New"/>
-                <w:color w:val="333333"/>
-              </w:rPr>
-              <w:t>OversampleFactor</w:t>
-            </w:r>
-          </w:p>
-        </w:tc>
-        <w:tc>
-          <w:tcPr>
-            <w:tcW w:w="2400" w:type="dxa"/>
-          </w:tcPr>
-          <w:p>
-            <w:r>
-              <w:rPr>
-                <w:rFonts w:ascii="Courier New" w:hAnsi="Courier New"/>
-                <w:color w:val="333333"/>
-              </w:rPr>
-              <w:t>0.0</w:t>
-            </w:r>
-          </w:p>
-        </w:tc>
-        <w:tc>
-          <w:tcPr>
-            <w:tcW w:w="2400" w:type="dxa"/>
-          </w:tcPr>
-          <w:p>
-            <w:r>
-              <w:t>Extra top candidates to fetch versions for during post-heap filtering.</w:t>
-            </w:r>
-          </w:p>
-        </w:tc>
-      </w:tr>
-      <w:tr>
-        <w:tc>
-          <w:tcPr>
-            <w:tcW w:w="2400" w:type="dxa"/>
-          </w:tcPr>
-          <w:p>
-            <w:r>
-              <w:rPr>
                 <w:rFonts w:ascii="Courier New" w:hAnsi="Courier New"/>
                 <w:color w:val="333333"/>
               </w:rPr>
@@ -513,6 +222,19 @@
           <w:color w:val="333333"/>
         </w:rPr>
         <w:t>VersionCacheMaxChunks=100000</w:t>
+      </w:r>
+    </w:p>
+    <w:p>
+      <w:pPr>
+        <w:pStyle w:val="Code"/>
+        <w:spacing w:before="80" w:after="80"/>
+      </w:pPr>
+      <w:r>
+        <w:rPr>
+          <w:rFonts w:ascii="Courier New" w:hAnsi="Courier New"/>
+          <w:color w:val="333333"/>
+        </w:rPr>
+        <w:t>VersionCacheTTLMs=0</w:t>
       </w:r>
     </w:p>
     <w:p>
@@ -2270,7 +1992,7 @@
           <w:rFonts w:ascii="Courier New" w:hAnsi="Courier New"/>
           <w:color w:val="333333"/>
         </w:rPr>
-        <w:t xml:space="preserve">    collect top K * (1 + OversampleFactor), capped at K + 100</w:t>
+        <w:t xml:space="preserve">    collect current result buffer VIDs</w:t>
       </w:r>
     </w:p>
     <w:p>
@@ -2454,18 +2176,82 @@
         </w:numPr>
       </w:pPr>
       <w:r>
-        <w:t>Cache hits use shared locking and do not reorder entries.</w:t>
-      </w:r>
-    </w:p>
-    <w:p>
-      <w:pPr>
-        <w:numPr>
-          <w:ilvl w:val="0"/>
-          <w:numId w:val="1"/>
-        </w:numPr>
-      </w:pPr>
-      <w:r>
-        <w:t>Cache misses fetch from TiKV and insert under an exclusive lock.</w:t>
+        <w:rPr>
+          <w:rFonts w:ascii="Courier New" w:hAnsi="Courier New"/>
+          <w:color w:val="333333"/>
+        </w:rPr>
+        <w:t>VersionCacheMaxChunks &lt;= 0</w:t>
+      </w:r>
+      <w:r>
+        <w:t xml:space="preserve"> disables the cache.</w:t>
+      </w:r>
+    </w:p>
+    <w:p>
+      <w:pPr>
+        <w:numPr>
+          <w:ilvl w:val="0"/>
+          <w:numId w:val="1"/>
+        </w:numPr>
+      </w:pPr>
+      <w:r>
+        <w:rPr>
+          <w:rFonts w:ascii="Courier New" w:hAnsi="Courier New"/>
+          <w:color w:val="333333"/>
+        </w:rPr>
+        <w:t>VersionCacheTTLMs &lt;= 0</w:t>
+      </w:r>
+      <w:r>
+        <w:t xml:space="preserve"> keeps the current pure-LRU behavior: cached chunks do not expire by age.</w:t>
+      </w:r>
+    </w:p>
+    <w:p>
+      <w:pPr>
+        <w:numPr>
+          <w:ilvl w:val="0"/>
+          <w:numId w:val="1"/>
+        </w:numPr>
+      </w:pPr>
+      <w:r>
+        <w:rPr>
+          <w:rFonts w:ascii="Courier New" w:hAnsi="Courier New"/>
+          <w:color w:val="333333"/>
+        </w:rPr>
+        <w:t>VersionCacheTTLMs &gt; 0</w:t>
+      </w:r>
+      <w:r>
+        <w:t xml:space="preserve"> makes cache hits valid only while </w:t>
+      </w:r>
+      <w:r>
+        <w:rPr>
+          <w:rFonts w:ascii="Courier New" w:hAnsi="Courier New"/>
+          <w:color w:val="333333"/>
+        </w:rPr>
+        <w:t>now - refreshTime &lt; VersionCacheTTLMs</w:t>
+      </w:r>
+      <w:r>
+        <w:t>.</w:t>
+      </w:r>
+    </w:p>
+    <w:p>
+      <w:pPr>
+        <w:numPr>
+          <w:ilvl w:val="0"/>
+          <w:numId w:val="1"/>
+        </w:numPr>
+      </w:pPr>
+      <w:r>
+        <w:t>Fresh cache hits use shared locking and do not reorder entries.</w:t>
+      </w:r>
+    </w:p>
+    <w:p>
+      <w:pPr>
+        <w:numPr>
+          <w:ilvl w:val="0"/>
+          <w:numId w:val="1"/>
+        </w:numPr>
+      </w:pPr>
+      <w:r>
+        <w:t>Cache misses and expired entries fetch from TiKV and insert under an exclusive lock.</w:t>
       </w:r>
     </w:p>
     <w:p>
@@ -2510,7 +2296,23 @@
     <w:p/>
     <w:p>
       <w:r>
-        <w:t>This cache reduces repeated chunk reads but is not a distributed coherence mechanism. Other processes can update TiKV without invalidating this process's cached chunks. Search paths can bypass cache when freshness is preferred.</w:t>
+        <w:t xml:space="preserve">Single-chunk reads use a striped refresh mutex so multiple threads do not all refresh the same expired/missing chunk at once. Batched reads group miss/expired chunks and refresh them with one TiKV </w:t>
+      </w:r>
+      <w:r>
+        <w:rPr>
+          <w:rFonts w:ascii="Courier New" w:hAnsi="Courier New"/>
+          <w:color w:val="333333"/>
+        </w:rPr>
+        <w:t>MultiGet</w:t>
+      </w:r>
+      <w:r>
+        <w:t>.</w:t>
+      </w:r>
+    </w:p>
+    <w:p/>
+    <w:p>
+      <w:r>
+        <w:t>This cache reduces repeated chunk reads but is not a distributed coherence mechanism. Other processes can update TiKV without invalidating this process's cached chunks before TTL expiry. Search paths can bypass cache when freshness is preferred.</w:t>
       </w:r>
     </w:p>
     <w:p/>
@@ -2700,6 +2502,44 @@
       </w:pPr>
       <w:r>
         <w:t>The LRU cache is local to one process and has no cross-process invalidation.</w:t>
+      </w:r>
+    </w:p>
+    <w:p>
+      <w:pPr>
+        <w:numPr>
+          <w:ilvl w:val="0"/>
+          <w:numId w:val="1"/>
+        </w:numPr>
+      </w:pPr>
+      <w:r>
+        <w:rPr>
+          <w:rFonts w:ascii="Courier New" w:hAnsi="Courier New"/>
+          <w:color w:val="333333"/>
+        </w:rPr>
+        <w:t>VersionCacheTTLMs</w:t>
+      </w:r>
+      <w:r>
+        <w:t xml:space="preserve"> bounds cache staleness only for code paths that use </w:t>
+      </w:r>
+      <w:r>
+        <w:rPr>
+          <w:rFonts w:ascii="Courier New" w:hAnsi="Courier New"/>
+          <w:color w:val="333333"/>
+        </w:rPr>
+        <w:t>UseCache</w:t>
+      </w:r>
+      <w:r>
+        <w:t xml:space="preserve">; </w:t>
+      </w:r>
+      <w:r>
+        <w:rPr>
+          <w:rFonts w:ascii="Courier New" w:hAnsi="Courier New"/>
+          <w:color w:val="333333"/>
+        </w:rPr>
+        <w:t>BypassCacheNoFill</w:t>
+      </w:r>
+      <w:r>
+        <w:t xml:space="preserve"> still reads TiKV directly.</w:t>
       </w:r>
     </w:p>
     <w:p>
@@ -2856,7 +2696,7 @@
     <w:lvl w:ilvl="0">
       <w:start w:val="1"/>
       <w:numFmt w:val="bullet"/>
-      <w:lvlText w:val="•"/>
+      <w:lvlText w:val="-"/>
       <w:lvlJc w:val="left"/>
       <w:pPr>
         <w:ind w:left="720" w:hanging="360"/>

</xml_diff>